<commit_message>
chore: synchronize Aletis server improvements and preserve private data
</commit_message>
<xml_diff>
--- a/apps/api/src/services/processo-assessoria/templates/IT.OP.001_Ferramenta_Google_Drive.docx
+++ b/apps/api/src/services/processo-assessoria/templates/IT.OP.001_Ferramenta_Google_Drive.docx
@@ -1429,7 +1429,7 @@
                 <w:sz w:val="24"/>
                 <w:szCs w:val="24"/>
               </w:rPr>
-              <w:t>Criar uma pasta principal nomeada “TEX CAPITAL –</w:t>
+              <w:t>Criar uma pasta principal nomeada “ALETIS –</w:t>
             </w:r>
             <w:r>
               <w:rPr>
@@ -3826,7 +3826,7 @@
                 <w:sz w:val="24"/>
                 <w:szCs w:val="24"/>
               </w:rPr>
-              <w:t xml:space="preserve"> a pasta TEX CAPITAL como </w:t>
+              <w:t xml:space="preserve"> a pasta ALETIS como </w:t>
             </w:r>
             <w:r>
               <w:rPr>

</xml_diff>